<commit_message>
Actualizacion documento de titulacion y presentacion para la defensa
</commit_message>
<xml_diff>
--- a/plan_titulacion.docx
+++ b/plan_titulacion.docx
@@ -24,7 +24,7 @@
                     <pic:cNvPicPr preferRelativeResize="0"/>
                   </pic:nvPicPr>
                   <pic:blipFill>
-                    <a:blip r:embed="rId6"/>
+                    <a:blip r:embed="rId8"/>
                     <a:srcRect l="10017" t="10053" r="9854" b="10888"/>
                     <a:stretch>
                       <a:fillRect/>
@@ -246,7 +246,21 @@
               <w:rPr>
                 <w:b/>
               </w:rPr>
-              <w:t>Integración de analítica en tiempo real y LLMs en la ingesta de metadatos y grabaciones telefónicas, para identificar prácticas de atención críticas y predecir anomalías en el rendimiento de los agentes de call center.</w:t>
+              <w:t xml:space="preserve">Integración de analítica en tiempo real y LLMs en la ingesta de metadatos y grabaciones telefónicas, para identificar prácticas de atención críticas y predecir anomalías en el rendimiento de los agentes de </w:t>
+            </w:r>
+            <w:proofErr w:type="gramStart"/>
+            <w:r>
+              <w:rPr>
+                <w:b/>
+              </w:rPr>
+              <w:t>call center</w:t>
+            </w:r>
+            <w:proofErr w:type="gramEnd"/>
+            <w:r>
+              <w:rPr>
+                <w:b/>
+              </w:rPr>
+              <w:t>.</w:t>
             </w:r>
           </w:p>
         </w:tc>
@@ -349,7 +363,7 @@
           <w:bCs/>
         </w:rPr>
         <w:sectPr>
-          <w:footerReference w:type="default" r:id="rId7"/>
+          <w:footerReference w:type="default" r:id="rId9"/>
           <w:pgSz w:w="11906" w:h="16838"/>
           <w:pgMar w:top="2552" w:right="1701" w:bottom="1417" w:left="1701" w:header="708" w:footer="708" w:gutter="0"/>
           <w:pgNumType w:start="1"/>
@@ -898,7 +912,15 @@
         </w:sdtContent>
       </w:sdt>
       <w:r>
-        <w:t xml:space="preserve">. En casos donde las auditorias son manuales, no se dispone de suficientes etiquetados para entrenar los modelos. Es por eso que los enfoques no supervisados se convierten en una alternativa adecuada. Berahmand et al. presentan un estudio sobre autocodificadores y sus aplicaciones en la reducción de patrones atípicos en los datos </w:t>
+        <w:t xml:space="preserve">. En casos donde las auditorias son manuales, no se dispone de suficientes etiquetados para entrenar los modelos. Es por eso </w:t>
+      </w:r>
+      <w:proofErr w:type="gramStart"/>
+      <w:r>
+        <w:t>que</w:t>
+      </w:r>
+      <w:proofErr w:type="gramEnd"/>
+      <w:r>
+        <w:t xml:space="preserve"> los enfoques no supervisados se convierten en una alternativa adecuada. Berahmand et al. presentan un estudio sobre autocodificadores y sus aplicaciones en la reducción de patrones atípicos en los datos </w:t>
       </w:r>
       <w:sdt>
         <w:sdtPr>
@@ -1008,7 +1030,15 @@
         <w:jc w:val="both"/>
       </w:pPr>
       <w:r>
-        <w:t xml:space="preserve">Los call center generan cada día grandes cantidades de información, principalmente en grabaciones de audio que no están estructuradas y que, en muchos casos, no se analizan completamente. En este trabajo, se dispone de </w:t>
+        <w:t xml:space="preserve">Los </w:t>
+      </w:r>
+      <w:proofErr w:type="gramStart"/>
+      <w:r>
+        <w:t>call center</w:t>
+      </w:r>
+      <w:proofErr w:type="gramEnd"/>
+      <w:r>
+        <w:t xml:space="preserve"> generan cada día grandes cantidades de información, principalmente en grabaciones de audio que no están estructuradas y que, en muchos casos, no se analizan completamente. En este trabajo, se dispone de </w:t>
       </w:r>
       <w:r>
         <w:t>más</w:t>
@@ -1131,7 +1161,25 @@
           <w:iCs/>
           <w:color w:val="404040"/>
         </w:rPr>
-        <w:t>¿Cómo diseñar e implementar una arquitectura que integre Modelos de Lenguaje de Gran Escala (LLM) y analítica en tiempo real sobre registros CDR y grabaciones de audio para identificar de forma escalable prácticas de atención críticas y predecir anomalías en el rendimiento de los agentes de un call center?</w:t>
+        <w:t xml:space="preserve">¿Cómo diseñar e implementar una arquitectura que integre Modelos de Lenguaje de Gran Escala (LLM) y analítica en tiempo real sobre registros CDR y grabaciones de audio para identificar de forma escalable prácticas de atención críticas y predecir anomalías en el rendimiento de los agentes de un </w:t>
+      </w:r>
+      <w:proofErr w:type="gramStart"/>
+      <w:r>
+        <w:rPr>
+          <w:i/>
+          <w:iCs/>
+          <w:color w:val="404040"/>
+        </w:rPr>
+        <w:t>call center</w:t>
+      </w:r>
+      <w:proofErr w:type="gramEnd"/>
+      <w:r>
+        <w:rPr>
+          <w:i/>
+          <w:iCs/>
+          <w:color w:val="404040"/>
+        </w:rPr>
+        <w:t>?</w:t>
       </w:r>
     </w:p>
     <w:p>
@@ -1180,7 +1228,15 @@
         <w:jc w:val="both"/>
       </w:pPr>
       <w:r>
-        <w:t>Implementar una solución de Big Data para el procesamiento concurrente de metadatos CDR y grabaciones de audio no estructuradas, mediante la integración de analítica en tiempo real (streaming) y Modelos de Lenguaje de Gran Escala (LLM), con el fin de identificar prácticas de atención críticas y predecir anomalías en el rendimiento de los agentes de un call center.</w:t>
+        <w:t xml:space="preserve">Implementar una solución de Big Data para el procesamiento concurrente de metadatos CDR y grabaciones de audio no estructuradas, mediante la integración de analítica en tiempo real (streaming) y Modelos de Lenguaje de Gran Escala (LLM), con el fin de identificar prácticas de atención críticas y predecir anomalías en el rendimiento de los agentes de un </w:t>
+      </w:r>
+      <w:proofErr w:type="gramStart"/>
+      <w:r>
+        <w:t>call center</w:t>
+      </w:r>
+      <w:proofErr w:type="gramEnd"/>
+      <w:r>
+        <w:t>.</w:t>
       </w:r>
     </w:p>
     <w:p>
@@ -1213,7 +1269,15 @@
         <w:jc w:val="both"/>
       </w:pPr>
       <w:r>
-        <w:t>Contextualizar los fundamentos teóricos sobre analítica en tiempo real, reconocimiento automático del habla (ASR) y Modelos de Lenguaje de Gran Escala aplicados al análisis de interacciones de call center, mediante una revisión sistemática de la literatura científica actualizada.</w:t>
+        <w:t xml:space="preserve">Contextualizar los fundamentos teóricos sobre analítica en tiempo real, reconocimiento automático del habla (ASR) y Modelos de Lenguaje de Gran Escala aplicados al análisis de interacciones de </w:t>
+      </w:r>
+      <w:proofErr w:type="gramStart"/>
+      <w:r>
+        <w:t>call center</w:t>
+      </w:r>
+      <w:proofErr w:type="gramEnd"/>
+      <w:r>
+        <w:t>, mediante una revisión sistemática de la literatura científica actualizada.</w:t>
       </w:r>
     </w:p>
     <w:p>
@@ -1291,7 +1355,31 @@
       </w:pPr>
       <w:r>
         <w:lastRenderedPageBreak/>
-        <w:t>Desde lo técnico, la propuesta permite integrar eficientemente el procesamiento de datos en tiempo real y procesamiento por lotes, incorporando mecanismos de privacidad y aprovechando la infraestructura ya disponible como Asterisk y la base de datos. En el plano académico, el estudio aporta una solución de posible referencia que puede ser replicada en otros escenarios, al combinar varias tecnologías para identificar practicas críticas de atención y posibles anomalías en el desempeño. Además, desde la perspectiva social, la solución brinda una mayor protección a los consumidores al facilitar la identificación de prácticas de venta inadecuadas y reducir el riesgo de incumplimiento normativo. Al mismo tiempo, proporciona a la empresa indicadores objetivo que apoyan la mejora de procesos hacia los agentes, favoreciendo la toma de decisiones informada por parte de la gerencia.</w:t>
+        <w:t>Desde lo técnico, la propuesta permite integrar el procesamiento de datos en tiempo real y por lotes, incorporando mecanismos de privacidad</w:t>
+      </w:r>
+      <w:r>
+        <w:t xml:space="preserve">, </w:t>
+      </w:r>
+      <w:r>
+        <w:t>aprovechando infraestructura disponible como Asterisk y</w:t>
+      </w:r>
+      <w:r>
+        <w:t xml:space="preserve"> </w:t>
+      </w:r>
+      <w:r>
+        <w:t xml:space="preserve">base de datos. En </w:t>
+      </w:r>
+      <w:r>
+        <w:t>lo</w:t>
+      </w:r>
+      <w:r>
+        <w:t xml:space="preserve"> académico, el estudio aporta una solución que puede ser replicada en otros escenarios, al combinar varias tecnologías para identificar practicas críticas de atención y posibles anomalías. Además, desde l</w:t>
+      </w:r>
+      <w:r>
+        <w:t xml:space="preserve">o </w:t>
+      </w:r>
+      <w:r>
+        <w:t>social, la solución brinda protección a los consumidores al facilitar la identificación de prácticas inadecuadas y reducir el riesgo de incumplimiento normativo. Al mismo tiempo, proporciona a la empresa indicadores que apoyan la mejora de procesos hacia los agentes, favoreciendo la toma de decisiones informada por parte de la gerencia.</w:t>
       </w:r>
     </w:p>
     <w:p>
@@ -1374,7 +1462,15 @@
         <w:t>auditoría</w:t>
       </w:r>
       <w:r>
-        <w:t xml:space="preserve"> y los agentes del call center. De forma indirecta, también se beneficiarán los clientes, al recibir atención </w:t>
+        <w:t xml:space="preserve"> y los agentes del </w:t>
+      </w:r>
+      <w:proofErr w:type="gramStart"/>
+      <w:r>
+        <w:t>call center</w:t>
+      </w:r>
+      <w:proofErr w:type="gramEnd"/>
+      <w:r>
+        <w:t xml:space="preserve">. De forma indirecta, también se beneficiarán los clientes, al recibir atención </w:t>
       </w:r>
       <w:r>
         <w:t>más</w:t>
@@ -1582,8 +1678,11 @@
         <w:jc w:val="both"/>
       </w:pPr>
       <w:r>
+        <w:t xml:space="preserve">La validación de la propuesta se llevará a cabo con la implementación en el entorno real de la empresa. Para esto, utilizaran un tablero analítico que presentara indicadores de calidad y rendimiento definidos por la empresa, </w:t>
+      </w:r>
+      <w:r>
         <w:lastRenderedPageBreak/>
-        <w:t>La validación de la propuesta se llevará a cabo con la implementación en el entorno real de la empresa. Para esto, utilizaran un tablero analítico que presentara indicadores de calidad y rendimiento definidos por la empresa, permitiendo monitorear de forma continua los resultados. Esta implementación facilitará la comparación entre el desempeño automatizado contra el proceso manual, con el fin de evaluar los beneficios de la solución y proporcionar información oportuna que apoye la toma de decisiones de la gerencia.</w:t>
+        <w:t>permitiendo monitorear de forma continua los resultados. Esta implementación facilitará la comparación entre el desempeño automatizado contra el proceso manual, con el fin de evaluar los beneficios de la solución y proporcionar información oportuna que apoye la toma de decisiones de la gerencia.</w:t>
       </w:r>
     </w:p>
     <w:p>
@@ -1779,7 +1878,15 @@
         <w:t>Población</w:t>
       </w:r>
       <w:r>
-        <w:t>: El universo de interacciones del call center registradas desde 2017, correspondiente a más de 100.000 registros CDR y más de 100 GB de grabaciones de audio.</w:t>
+        <w:t xml:space="preserve">: El universo de interacciones del </w:t>
+      </w:r>
+      <w:proofErr w:type="gramStart"/>
+      <w:r>
+        <w:t>call center</w:t>
+      </w:r>
+      <w:proofErr w:type="gramEnd"/>
+      <w:r>
+        <w:t xml:space="preserve"> registradas desde 2017, correspondiente a más de 100.000 registros CDR y más de 100 GB de grabaciones de audio.</w:t>
       </w:r>
     </w:p>
     <w:p>
@@ -1916,7 +2023,15 @@
       </w:r>
       <w:proofErr w:type="spellEnd"/>
       <w:r>
-        <w:t>, para el reprocesamiento masivo del histórico por rangos de fechas bajo la misma lógica de limpieza y validación.</w:t>
+        <w:t xml:space="preserve">, para el </w:t>
+      </w:r>
+      <w:proofErr w:type="gramStart"/>
+      <w:r>
+        <w:t>reprocesamiento masivo</w:t>
+      </w:r>
+      <w:proofErr w:type="gramEnd"/>
+      <w:r>
+        <w:t xml:space="preserve"> del histórico por rangos de fechas bajo la misma lógica de limpieza y validación.</w:t>
       </w:r>
     </w:p>
     <w:p>
@@ -2478,7 +2593,23 @@
               <w:color w:val="000000"/>
               <w:lang w:val="en-US"/>
             </w:rPr>
-            <w:t>: 10.21503/cyd.v28i1.2830.</w:t>
+            <w:t>: 10.21503/</w:t>
+          </w:r>
+          <w:proofErr w:type="gramStart"/>
+          <w:r>
+            <w:rPr>
+              <w:color w:val="000000"/>
+              <w:lang w:val="en-US"/>
+            </w:rPr>
+            <w:t>cyd.v</w:t>
+          </w:r>
+          <w:proofErr w:type="gramEnd"/>
+          <w:r>
+            <w:rPr>
+              <w:color w:val="000000"/>
+              <w:lang w:val="en-US"/>
+            </w:rPr>
+            <w:t>28i1.2830.</w:t>
           </w:r>
         </w:p>
         <w:p>
@@ -2593,6 +2724,7 @@
             <w:tab/>
             <w:t xml:space="preserve">A. Koenecke, A. S. G. Choi, K. X. Mei, H. Schellmann, and M. Sloane, “Careless Whisper: Speech-to-Text Hallucination Harms,” in </w:t>
           </w:r>
+          <w:proofErr w:type="gramStart"/>
           <w:r>
             <w:rPr>
               <w:i/>
@@ -2600,7 +2732,17 @@
               <w:color w:val="000000"/>
               <w:lang w:val="en-US"/>
             </w:rPr>
-            <w:t>The 2024 ACM Conference on Fairness, Accountability, and Transparency</w:t>
+            <w:t>The</w:t>
+          </w:r>
+          <w:proofErr w:type="gramEnd"/>
+          <w:r>
+            <w:rPr>
+              <w:i/>
+              <w:iCs/>
+              <w:color w:val="000000"/>
+              <w:lang w:val="en-US"/>
+            </w:rPr>
+            <w:t xml:space="preserve"> 2024 ACM Conference on Fairness, Accountability, and Transparency</w:t>
           </w:r>
           <w:r>
             <w:rPr>
@@ -3579,8 +3721,8 @@
     </w:p>
     <w:p/>
     <w:sectPr>
-      <w:headerReference w:type="default" r:id="rId8"/>
-      <w:footerReference w:type="default" r:id="rId9"/>
+      <w:headerReference w:type="default" r:id="rId10"/>
+      <w:footerReference w:type="default" r:id="rId11"/>
       <w:pgSz w:w="12240" w:h="15840"/>
       <w:pgMar w:top="1411" w:right="1411" w:bottom="1411" w:left="1411" w:header="706" w:footer="706" w:gutter="0"/>
       <w:cols w:space="720"/>
@@ -3588,6 +3730,25 @@
     </w:sectPr>
   </w:body>
 </w:document>
+</file>
+
+<file path=word/endnotes.xml><?xml version="1.0" encoding="utf-8"?>
+<w:endnotes xmlns:wpc="http://schemas.microsoft.com/office/word/2010/wordprocessingCanvas" xmlns:cx="http://schemas.microsoft.com/office/drawing/2014/chartex" xmlns:cx1="http://schemas.microsoft.com/office/drawing/2015/9/8/chartex" xmlns:cx2="http://schemas.microsoft.com/office/drawing/2015/10/21/chartex" xmlns:cx3="http://schemas.microsoft.com/office/drawing/2016/5/9/chartex" xmlns:cx4="http://schemas.microsoft.com/office/drawing/2016/5/10/chartex" xmlns:cx5="http://schemas.microsoft.com/office/drawing/2016/5/11/chartex" xmlns:cx6="http://schemas.microsoft.com/office/drawing/2016/5/12/chartex" xmlns:cx7="http://schemas.microsoft.com/office/drawing/2016/5/13/chartex" xmlns:cx8="http://schemas.microsoft.com/office/drawing/2016/5/14/chartex" xmlns:mc="http://schemas.openxmlformats.org/markup-compatibility/2006" xmlns:aink="http://schemas.microsoft.com/office/drawing/2016/ink" xmlns:am3d="http://schemas.microsoft.com/office/drawing/2017/model3d" xmlns:o="urn:schemas-microsoft-com:office:office" xmlns:oel="http://schemas.microsoft.com/office/2019/extlst" xmlns:r="http://schemas.openxmlformats.org/officeDocument/2006/relationships" xmlns:m="http://schemas.openxmlformats.org/officeDocument/2006/math" xmlns:v="urn:schemas-microsoft-com:vml" xmlns:wp14="http://schemas.microsoft.com/office/word/2010/wordprocessingDrawing" xmlns:wp="http://schemas.openxmlformats.org/drawingml/2006/wordprocessingDrawing" xmlns:w10="urn:schemas-microsoft-com:office:word" xmlns:w="http://schemas.openxmlformats.org/wordprocessingml/2006/main" xmlns:w14="http://schemas.microsoft.com/office/word/2010/wordml" xmlns:w15="http://schemas.microsoft.com/office/word/2012/wordml" xmlns:w16cex="http://schemas.microsoft.com/office/word/2018/wordml/cex" xmlns:w16cid="http://schemas.microsoft.com/office/word/2016/wordml/cid" xmlns:w16="http://schemas.microsoft.com/office/word/2018/wordml" xmlns:w16du="http://schemas.microsoft.com/office/word/2023/wordml/word16du" xmlns:w16sdtdh="http://schemas.microsoft.com/office/word/2020/wordml/sdtdatahash" xmlns:w16sdtfl="http://schemas.microsoft.com/office/word/2024/wordml/sdtformatlock" xmlns:w16se="http://schemas.microsoft.com/office/word/2015/wordml/symex" xmlns:wpg="http://schemas.microsoft.com/office/word/2010/wordprocessingGroup" xmlns:wpi="http://schemas.microsoft.com/office/word/2010/wordprocessingInk" xmlns:wne="http://schemas.microsoft.com/office/word/2006/wordml" xmlns:wps="http://schemas.microsoft.com/office/word/2010/wordprocessingShape" mc:Ignorable="w14 w15 w16se w16cid w16 w16cex w16sdtdh w16sdtfl w16du wp14">
+  <w:endnote w:type="separator" w:id="-1">
+    <w:p>
+      <w:r>
+        <w:separator/>
+      </w:r>
+    </w:p>
+  </w:endnote>
+  <w:endnote w:type="continuationSeparator" w:id="0">
+    <w:p>
+      <w:r>
+        <w:continuationSeparator/>
+      </w:r>
+    </w:p>
+  </w:endnote>
+</w:endnotes>
 </file>
 
 <file path=word/footer1.xml><?xml version="1.0" encoding="utf-8"?>
@@ -3658,6 +3819,25 @@
     </w:pPr>
   </w:p>
 </w:ftr>
+</file>
+
+<file path=word/footnotes.xml><?xml version="1.0" encoding="utf-8"?>
+<w:footnotes xmlns:wpc="http://schemas.microsoft.com/office/word/2010/wordprocessingCanvas" xmlns:cx="http://schemas.microsoft.com/office/drawing/2014/chartex" xmlns:cx1="http://schemas.microsoft.com/office/drawing/2015/9/8/chartex" xmlns:cx2="http://schemas.microsoft.com/office/drawing/2015/10/21/chartex" xmlns:cx3="http://schemas.microsoft.com/office/drawing/2016/5/9/chartex" xmlns:cx4="http://schemas.microsoft.com/office/drawing/2016/5/10/chartex" xmlns:cx5="http://schemas.microsoft.com/office/drawing/2016/5/11/chartex" xmlns:cx6="http://schemas.microsoft.com/office/drawing/2016/5/12/chartex" xmlns:cx7="http://schemas.microsoft.com/office/drawing/2016/5/13/chartex" xmlns:cx8="http://schemas.microsoft.com/office/drawing/2016/5/14/chartex" xmlns:mc="http://schemas.openxmlformats.org/markup-compatibility/2006" xmlns:aink="http://schemas.microsoft.com/office/drawing/2016/ink" xmlns:am3d="http://schemas.microsoft.com/office/drawing/2017/model3d" xmlns:o="urn:schemas-microsoft-com:office:office" xmlns:oel="http://schemas.microsoft.com/office/2019/extlst" xmlns:r="http://schemas.openxmlformats.org/officeDocument/2006/relationships" xmlns:m="http://schemas.openxmlformats.org/officeDocument/2006/math" xmlns:v="urn:schemas-microsoft-com:vml" xmlns:wp14="http://schemas.microsoft.com/office/word/2010/wordprocessingDrawing" xmlns:wp="http://schemas.openxmlformats.org/drawingml/2006/wordprocessingDrawing" xmlns:w10="urn:schemas-microsoft-com:office:word" xmlns:w="http://schemas.openxmlformats.org/wordprocessingml/2006/main" xmlns:w14="http://schemas.microsoft.com/office/word/2010/wordml" xmlns:w15="http://schemas.microsoft.com/office/word/2012/wordml" xmlns:w16cex="http://schemas.microsoft.com/office/word/2018/wordml/cex" xmlns:w16cid="http://schemas.microsoft.com/office/word/2016/wordml/cid" xmlns:w16="http://schemas.microsoft.com/office/word/2018/wordml" xmlns:w16du="http://schemas.microsoft.com/office/word/2023/wordml/word16du" xmlns:w16sdtdh="http://schemas.microsoft.com/office/word/2020/wordml/sdtdatahash" xmlns:w16sdtfl="http://schemas.microsoft.com/office/word/2024/wordml/sdtformatlock" xmlns:w16se="http://schemas.microsoft.com/office/word/2015/wordml/symex" xmlns:wpg="http://schemas.microsoft.com/office/word/2010/wordprocessingGroup" xmlns:wpi="http://schemas.microsoft.com/office/word/2010/wordprocessingInk" xmlns:wne="http://schemas.microsoft.com/office/word/2006/wordml" xmlns:wps="http://schemas.microsoft.com/office/word/2010/wordprocessingShape" mc:Ignorable="w14 w15 w16se w16cid w16 w16cex w16sdtdh w16sdtfl w16du wp14">
+  <w:footnote w:type="separator" w:id="-1">
+    <w:p>
+      <w:r>
+        <w:separator/>
+      </w:r>
+    </w:p>
+  </w:footnote>
+  <w:footnote w:type="continuationSeparator" w:id="0">
+    <w:p>
+      <w:r>
+        <w:continuationSeparator/>
+      </w:r>
+    </w:p>
+  </w:footnote>
+</w:footnotes>
 </file>
 
 <file path=word/header1.xml><?xml version="1.0" encoding="utf-8"?>
@@ -5859,6 +6039,9 @@
     <w:rsid w:val="00212EC2"/>
     <w:rsid w:val="00223DE9"/>
     <w:rsid w:val="004A47C6"/>
+    <w:rsid w:val="00534B97"/>
+    <w:rsid w:val="00D863CA"/>
+    <w:rsid w:val="00EB4DE7"/>
   </w:rsids>
   <m:mathPr>
     <m:mathFont m:val="Cambria Math"/>
@@ -6318,74 +6501,6 @@
     <w:rPr>
       <w:color w:val="666666"/>
     </w:rPr>
-  </w:style>
-  <w:style w:type="paragraph" w:customStyle="1" w:styleId="4301A4C3D04543DF9E10FCADD77337B0">
-    <w:name w:val="4301A4C3D04543DF9E10FCADD77337B0"/>
-    <w:rsid w:val="00223DE9"/>
-  </w:style>
-  <w:style w:type="paragraph" w:customStyle="1" w:styleId="C5C141091E83483A9E64DA96FFAD7C1A">
-    <w:name w:val="C5C141091E83483A9E64DA96FFAD7C1A"/>
-    <w:rsid w:val="00223DE9"/>
-  </w:style>
-  <w:style w:type="paragraph" w:customStyle="1" w:styleId="C938F406C6F54F8A81AD19CE909AF24E">
-    <w:name w:val="C938F406C6F54F8A81AD19CE909AF24E"/>
-    <w:rsid w:val="00223DE9"/>
-  </w:style>
-  <w:style w:type="paragraph" w:customStyle="1" w:styleId="93030DE296A54BF591AB320F65085FC9">
-    <w:name w:val="93030DE296A54BF591AB320F65085FC9"/>
-    <w:rsid w:val="00223DE9"/>
-  </w:style>
-  <w:style w:type="paragraph" w:customStyle="1" w:styleId="7D68D183B54A4C0CA92B742C1AA8A0DE">
-    <w:name w:val="7D68D183B54A4C0CA92B742C1AA8A0DE"/>
-    <w:rsid w:val="00223DE9"/>
-  </w:style>
-  <w:style w:type="paragraph" w:customStyle="1" w:styleId="EAAD582FD13E4850A4526B77DDF1498E">
-    <w:name w:val="EAAD582FD13E4850A4526B77DDF1498E"/>
-    <w:rsid w:val="00223DE9"/>
-  </w:style>
-  <w:style w:type="paragraph" w:customStyle="1" w:styleId="369D044E3520451EA47E07950D176425">
-    <w:name w:val="369D044E3520451EA47E07950D176425"/>
-    <w:rsid w:val="00223DE9"/>
-  </w:style>
-  <w:style w:type="paragraph" w:customStyle="1" w:styleId="82B13AD5B56C41FC85B79A344DC35A8B">
-    <w:name w:val="82B13AD5B56C41FC85B79A344DC35A8B"/>
-    <w:rsid w:val="00223DE9"/>
-  </w:style>
-  <w:style w:type="paragraph" w:customStyle="1" w:styleId="F2DC9B6E93174112A2ABDE8682AAB826">
-    <w:name w:val="F2DC9B6E93174112A2ABDE8682AAB826"/>
-    <w:rsid w:val="00223DE9"/>
-  </w:style>
-  <w:style w:type="paragraph" w:customStyle="1" w:styleId="990470CC5AA84AD4AB6CE455BE3B92D5">
-    <w:name w:val="990470CC5AA84AD4AB6CE455BE3B92D5"/>
-    <w:rsid w:val="00223DE9"/>
-  </w:style>
-  <w:style w:type="paragraph" w:customStyle="1" w:styleId="00E23C8548A644FA9EC3CE8D8FA49A9D">
-    <w:name w:val="00E23C8548A644FA9EC3CE8D8FA49A9D"/>
-    <w:rsid w:val="00223DE9"/>
-  </w:style>
-  <w:style w:type="paragraph" w:customStyle="1" w:styleId="B80B54458A9845B1BE62BA4D6F42CD16">
-    <w:name w:val="B80B54458A9845B1BE62BA4D6F42CD16"/>
-    <w:rsid w:val="00223DE9"/>
-  </w:style>
-  <w:style w:type="paragraph" w:customStyle="1" w:styleId="2C32F1124E844D45B1111A8965A0BCC6">
-    <w:name w:val="2C32F1124E844D45B1111A8965A0BCC6"/>
-    <w:rsid w:val="00223DE9"/>
-  </w:style>
-  <w:style w:type="paragraph" w:customStyle="1" w:styleId="F5EC8EEEAA7C472C99F8189E766EC1E8">
-    <w:name w:val="F5EC8EEEAA7C472C99F8189E766EC1E8"/>
-    <w:rsid w:val="00223DE9"/>
-  </w:style>
-  <w:style w:type="paragraph" w:customStyle="1" w:styleId="E19273C08CE0492A8B30E4588E293F4D">
-    <w:name w:val="E19273C08CE0492A8B30E4588E293F4D"/>
-    <w:rsid w:val="00223DE9"/>
-  </w:style>
-  <w:style w:type="paragraph" w:customStyle="1" w:styleId="538EBD23B7B04EEE9AD7C855C3A1FBE7">
-    <w:name w:val="538EBD23B7B04EEE9AD7C855C3A1FBE7"/>
-    <w:rsid w:val="00223DE9"/>
-  </w:style>
-  <w:style w:type="paragraph" w:customStyle="1" w:styleId="92E730506721458F842D4EAD439FBF2B">
-    <w:name w:val="92E730506721458F842D4EAD439FBF2B"/>
-    <w:rsid w:val="00223DE9"/>
   </w:style>
   <w:style w:type="paragraph" w:customStyle="1" w:styleId="92A048994EE7462FA5C1F18F998074A3">
     <w:name w:val="92A048994EE7462FA5C1F18F998074A3"/>

</xml_diff>

<commit_message>
Finalizacion Plan de Implementacion con su presentacion para la defensa
</commit_message>
<xml_diff>
--- a/plan_titulacion.docx
+++ b/plan_titulacion.docx
@@ -246,21 +246,7 @@
               <w:rPr>
                 <w:b/>
               </w:rPr>
-              <w:t xml:space="preserve">Integración de analítica en tiempo real y LLMs en la ingesta de metadatos y grabaciones telefónicas, para identificar prácticas de atención críticas y predecir anomalías en el rendimiento de los agentes de </w:t>
-            </w:r>
-            <w:proofErr w:type="gramStart"/>
-            <w:r>
-              <w:rPr>
-                <w:b/>
-              </w:rPr>
-              <w:t>call center</w:t>
-            </w:r>
-            <w:proofErr w:type="gramEnd"/>
-            <w:r>
-              <w:rPr>
-                <w:b/>
-              </w:rPr>
-              <w:t>.</w:t>
+              <w:t>Integración de analítica en tiempo real y LLMs en la ingesta de metadatos y grabaciones telefónicas, para identificar prácticas de atención críticas y predecir anomalías en el rendimiento de los agentes de call center.</w:t>
             </w:r>
           </w:p>
         </w:tc>
@@ -438,15 +424,7 @@
         <w:jc w:val="both"/>
       </w:pPr>
       <w:r>
-        <w:t xml:space="preserve">El manejo de grandes cantidades de datos que requieren respuestas rápidas ha dado lugar a diferentes modelos de arquitectura para su procesamiento. Entre los </w:t>
-      </w:r>
-      <w:proofErr w:type="spellStart"/>
-      <w:r>
-        <w:t>mas</w:t>
-      </w:r>
-      <w:proofErr w:type="spellEnd"/>
-      <w:r>
-        <w:t xml:space="preserve"> conocidos se encuentra la arquitectura Lamba, que combina el procesamiento de datos histórico por lotes con el procesamiento de información en tiempo real, permitiendo obtener resultados precisos sin perder velocidad en el análisis de nuevos datos</w:t>
+        <w:t>El manejo de grandes cantidades de datos que requieren respuestas rápidas ha dado lugar a diferentes modelos de arquitectura para su procesamiento. Entre los mas conocidos se encuentra la arquitectura Lamba, que combina el procesamiento de datos histórico por lotes con el procesamiento de información en tiempo real, permitiendo obtener resultados precisos sin perder velocidad en el análisis de nuevos datos</w:t>
       </w:r>
       <w:r>
         <w:rPr>
@@ -640,15 +618,7 @@
         </w:sdtContent>
       </w:sdt>
       <w:r>
-        <w:t xml:space="preserve">. Por esta razón, se recomienda incorporar mecanismos que permitan validar la calidad de las transcripciones. Igualmente, Harris et al. identifican la existencia de sesgos en cuanto al </w:t>
-      </w:r>
-      <w:proofErr w:type="spellStart"/>
-      <w:r>
-        <w:t>genero</w:t>
-      </w:r>
-      <w:proofErr w:type="spellEnd"/>
-      <w:r>
-        <w:t xml:space="preserve"> y variantes de dialecto en los ASR </w:t>
+        <w:t xml:space="preserve">. Por esta razón, se recomienda incorporar mecanismos que permitan validar la calidad de las transcripciones. Igualmente, Harris et al. identifican la existencia de sesgos en cuanto al genero y variantes de dialecto en los ASR </w:t>
       </w:r>
       <w:sdt>
         <w:sdtPr>
@@ -912,15 +882,7 @@
         </w:sdtContent>
       </w:sdt>
       <w:r>
-        <w:t xml:space="preserve">. En casos donde las auditorias son manuales, no se dispone de suficientes etiquetados para entrenar los modelos. Es por eso </w:t>
-      </w:r>
-      <w:proofErr w:type="gramStart"/>
-      <w:r>
-        <w:t>que</w:t>
-      </w:r>
-      <w:proofErr w:type="gramEnd"/>
-      <w:r>
-        <w:t xml:space="preserve"> los enfoques no supervisados se convierten en una alternativa adecuada. Berahmand et al. presentan un estudio sobre autocodificadores y sus aplicaciones en la reducción de patrones atípicos en los datos </w:t>
+        <w:t xml:space="preserve">. En casos donde las auditorias son manuales, no se dispone de suficientes etiquetados para entrenar los modelos. Es por eso que los enfoques no supervisados se convierten en una alternativa adecuada. Berahmand et al. presentan un estudio sobre autocodificadores y sus aplicaciones en la reducción de patrones atípicos en los datos </w:t>
       </w:r>
       <w:sdt>
         <w:sdtPr>
@@ -1030,15 +992,7 @@
         <w:jc w:val="both"/>
       </w:pPr>
       <w:r>
-        <w:t xml:space="preserve">Los </w:t>
-      </w:r>
-      <w:proofErr w:type="gramStart"/>
-      <w:r>
-        <w:t>call center</w:t>
-      </w:r>
-      <w:proofErr w:type="gramEnd"/>
-      <w:r>
-        <w:t xml:space="preserve"> generan cada día grandes cantidades de información, principalmente en grabaciones de audio que no están estructuradas y que, en muchos casos, no se analizan completamente. En este trabajo, se dispone de </w:t>
+        <w:t xml:space="preserve">Los call center generan cada día grandes cantidades de información, principalmente en grabaciones de audio que no están estructuradas y que, en muchos casos, no se analizan completamente. En este trabajo, se dispone de </w:t>
       </w:r>
       <w:r>
         <w:t>más</w:t>
@@ -1161,25 +1115,7 @@
           <w:iCs/>
           <w:color w:val="404040"/>
         </w:rPr>
-        <w:t xml:space="preserve">¿Cómo diseñar e implementar una arquitectura que integre Modelos de Lenguaje de Gran Escala (LLM) y analítica en tiempo real sobre registros CDR y grabaciones de audio para identificar de forma escalable prácticas de atención críticas y predecir anomalías en el rendimiento de los agentes de un </w:t>
-      </w:r>
-      <w:proofErr w:type="gramStart"/>
-      <w:r>
-        <w:rPr>
-          <w:i/>
-          <w:iCs/>
-          <w:color w:val="404040"/>
-        </w:rPr>
-        <w:t>call center</w:t>
-      </w:r>
-      <w:proofErr w:type="gramEnd"/>
-      <w:r>
-        <w:rPr>
-          <w:i/>
-          <w:iCs/>
-          <w:color w:val="404040"/>
-        </w:rPr>
-        <w:t>?</w:t>
+        <w:t>¿Cómo diseñar e implementar una arquitectura que integre Modelos de Lenguaje de Gran Escala (LLM) y analítica en tiempo real sobre registros CDR y grabaciones de audio para identificar de forma escalable prácticas de atención críticas y predecir anomalías en el rendimiento de los agentes de un call center?</w:t>
       </w:r>
     </w:p>
     <w:p>
@@ -1228,15 +1164,7 @@
         <w:jc w:val="both"/>
       </w:pPr>
       <w:r>
-        <w:t xml:space="preserve">Implementar una solución de Big Data para el procesamiento concurrente de metadatos CDR y grabaciones de audio no estructuradas, mediante la integración de analítica en tiempo real (streaming) y Modelos de Lenguaje de Gran Escala (LLM), con el fin de identificar prácticas de atención críticas y predecir anomalías en el rendimiento de los agentes de un </w:t>
-      </w:r>
-      <w:proofErr w:type="gramStart"/>
-      <w:r>
-        <w:t>call center</w:t>
-      </w:r>
-      <w:proofErr w:type="gramEnd"/>
-      <w:r>
-        <w:t>.</w:t>
+        <w:t>Implementar una solución de Big Data para el procesamiento concurrente de metadatos CDR y grabaciones de audio no estructuradas, mediante la integración de analítica en tiempo real (streaming) y Modelos de Lenguaje de Gran Escala (LLM), con el fin de identificar prácticas de atención críticas y predecir anomalías en el rendimiento de los agentes de un call center.</w:t>
       </w:r>
     </w:p>
     <w:p>
@@ -1269,15 +1197,7 @@
         <w:jc w:val="both"/>
       </w:pPr>
       <w:r>
-        <w:t xml:space="preserve">Contextualizar los fundamentos teóricos sobre analítica en tiempo real, reconocimiento automático del habla (ASR) y Modelos de Lenguaje de Gran Escala aplicados al análisis de interacciones de </w:t>
-      </w:r>
-      <w:proofErr w:type="gramStart"/>
-      <w:r>
-        <w:t>call center</w:t>
-      </w:r>
-      <w:proofErr w:type="gramEnd"/>
-      <w:r>
-        <w:t>, mediante una revisión sistemática de la literatura científica actualizada.</w:t>
+        <w:t>Contextualizar los fundamentos teóricos sobre analítica en tiempo real, reconocimiento automático del habla (ASR) y Modelos de Lenguaje de Gran Escala aplicados al análisis de interacciones de call center, mediante una revisión de la literatura científica actualizada.</w:t>
       </w:r>
     </w:p>
     <w:p>
@@ -1462,15 +1382,7 @@
         <w:t>auditoría</w:t>
       </w:r>
       <w:r>
-        <w:t xml:space="preserve"> y los agentes del </w:t>
-      </w:r>
-      <w:proofErr w:type="gramStart"/>
-      <w:r>
-        <w:t>call center</w:t>
-      </w:r>
-      <w:proofErr w:type="gramEnd"/>
-      <w:r>
-        <w:t xml:space="preserve">. De forma indirecta, también se beneficiarán los clientes, al recibir atención </w:t>
+        <w:t xml:space="preserve"> y los agentes del call center. De forma indirecta, también se beneficiarán los clientes, al recibir atención </w:t>
       </w:r>
       <w:r>
         <w:t>más</w:t>
@@ -1533,23 +1445,7 @@
         <w:jc w:val="both"/>
       </w:pPr>
       <w:r>
-        <w:t xml:space="preserve">El trabajo adopta un enfoque cuantitativo, ya que busca evaluar de manera objetiva el desempeño de la solución a través de indicadores medibles relacionados con la calidad y rendimiento. Para el desarrollo de utiliza el marco metodológico </w:t>
-      </w:r>
-      <w:proofErr w:type="spellStart"/>
-      <w:r>
-        <w:t>Design</w:t>
-      </w:r>
-      <w:proofErr w:type="spellEnd"/>
-      <w:r>
-        <w:t xml:space="preserve"> Science </w:t>
-      </w:r>
-      <w:proofErr w:type="spellStart"/>
-      <w:r>
-        <w:t>Research</w:t>
-      </w:r>
-      <w:proofErr w:type="spellEnd"/>
-      <w:r>
-        <w:t xml:space="preserve"> (DSR)</w:t>
+        <w:t>El trabajo adopta un enfoque cuantitativo, ya que busca evaluar de manera objetiva el desempeño de la solución a través de indicadores medibles relacionados con la calidad y rendimiento. Para el desarrollo de utiliza el marco metodológico Design Science Research (DSR)</w:t>
       </w:r>
       <w:r>
         <w:t xml:space="preserve"> </w:t>
@@ -1587,31 +1483,7 @@
         <w:jc w:val="both"/>
       </w:pPr>
       <w:r>
-        <w:t>Como metodología del ciclo de datos aplicaremos CRISP-DM (Cross-</w:t>
-      </w:r>
-      <w:proofErr w:type="spellStart"/>
-      <w:r>
-        <w:t>Industry</w:t>
-      </w:r>
-      <w:proofErr w:type="spellEnd"/>
-      <w:r>
-        <w:t xml:space="preserve"> Standard Process </w:t>
-      </w:r>
-      <w:proofErr w:type="spellStart"/>
-      <w:r>
-        <w:t>for</w:t>
-      </w:r>
-      <w:proofErr w:type="spellEnd"/>
-      <w:r>
-        <w:t xml:space="preserve"> Data </w:t>
-      </w:r>
-      <w:proofErr w:type="spellStart"/>
-      <w:r>
-        <w:t>Mining</w:t>
-      </w:r>
-      <w:proofErr w:type="spellEnd"/>
-      <w:r>
-        <w:t>)</w:t>
+        <w:t>Como metodología del ciclo de datos aplicaremos CRISP-DM (Cross-Industry Standard Process for Data Mining)</w:t>
       </w:r>
       <w:r>
         <w:t xml:space="preserve"> </w:t>
@@ -1878,15 +1750,7 @@
         <w:t>Población</w:t>
       </w:r>
       <w:r>
-        <w:t xml:space="preserve">: El universo de interacciones del </w:t>
-      </w:r>
-      <w:proofErr w:type="gramStart"/>
-      <w:r>
-        <w:t>call center</w:t>
-      </w:r>
-      <w:proofErr w:type="gramEnd"/>
-      <w:r>
-        <w:t xml:space="preserve"> registradas desde 2017, correspondiente a más de 100.000 registros CDR y más de 100 GB de grabaciones de audio.</w:t>
+        <w:t>: El universo de interacciones del call center registradas desde 2017, correspondiente a más de 100.000 registros CDR y más de 100 GB de grabaciones de audio.</w:t>
       </w:r>
     </w:p>
     <w:p>
@@ -2015,23 +1879,7 @@
         <w:t>Procesamiento distribuido por lotes</w:t>
       </w:r>
       <w:r>
-        <w:t xml:space="preserve">: Apache Spark / </w:t>
-      </w:r>
-      <w:proofErr w:type="spellStart"/>
-      <w:r>
-        <w:t>PySpark</w:t>
-      </w:r>
-      <w:proofErr w:type="spellEnd"/>
-      <w:r>
-        <w:t xml:space="preserve">, para el </w:t>
-      </w:r>
-      <w:proofErr w:type="gramStart"/>
-      <w:r>
-        <w:t>reprocesamiento masivo</w:t>
-      </w:r>
-      <w:proofErr w:type="gramEnd"/>
-      <w:r>
-        <w:t xml:space="preserve"> del histórico por rangos de fechas bajo la misma lógica de limpieza y validación.</w:t>
+        <w:t>: Apache Spark / PySpark, para el reprocesamiento masivo del histórico por rangos de fechas bajo la misma lógica de limpieza y validación.</w:t>
       </w:r>
     </w:p>
     <w:p>
@@ -2091,15 +1939,7 @@
         <w:t>Entorno de programación</w:t>
       </w:r>
       <w:r>
-        <w:t xml:space="preserve">: Python con pandas, </w:t>
-      </w:r>
-      <w:proofErr w:type="spellStart"/>
-      <w:r>
-        <w:t>PySpark</w:t>
-      </w:r>
-      <w:proofErr w:type="spellEnd"/>
-      <w:r>
-        <w:t xml:space="preserve"> y librerías de aprendizaje automático para la preparación de datos, el cálculo de indicadores y la evaluación de los modelos.</w:t>
+        <w:t>: Python con pandas, PySpark y librerías de aprendizaje automático para la preparación de datos, el cálculo de indicadores y la evaluación de los modelos.</w:t>
       </w:r>
     </w:p>
     <w:p>
@@ -2187,31 +2027,7 @@
         <w:t>Identificación de prácticas de atención críticas</w:t>
       </w:r>
       <w:r>
-        <w:t xml:space="preserve">:  </w:t>
-      </w:r>
-      <w:proofErr w:type="spellStart"/>
-      <w:r>
-        <w:t>Accuracy</w:t>
-      </w:r>
-      <w:proofErr w:type="spellEnd"/>
-      <w:r>
-        <w:t xml:space="preserve">, </w:t>
-      </w:r>
-      <w:proofErr w:type="spellStart"/>
-      <w:r>
-        <w:t>Precision</w:t>
-      </w:r>
-      <w:proofErr w:type="spellEnd"/>
-      <w:r>
-        <w:t xml:space="preserve">, </w:t>
-      </w:r>
-      <w:proofErr w:type="spellStart"/>
-      <w:r>
-        <w:t>Recall</w:t>
-      </w:r>
-      <w:proofErr w:type="spellEnd"/>
-      <w:r>
-        <w:t xml:space="preserve"> y F1-score, calculadas sobre el conjunto de datos, para cuantificar la exactitud del sistema en la detección de malas prácticas y del cumplimiento de los parámetros de calidad definidos por la empresa.</w:t>
+        <w:t>:  Accuracy, Precision, Recall y F1-score, calculadas sobre el conjunto de datos, para cuantificar la exactitud del sistema en la detección de malas prácticas y del cumplimiento de los parámetros de calidad definidos por la empresa.</w:t>
       </w:r>
     </w:p>
     <w:p>
@@ -2291,39 +2107,7 @@
         <w:t>Herramientas de análisis</w:t>
       </w:r>
       <w:r>
-        <w:t xml:space="preserve">: Python (pandas, </w:t>
-      </w:r>
-      <w:proofErr w:type="spellStart"/>
-      <w:r>
-        <w:t>scikit-learn</w:t>
-      </w:r>
-      <w:proofErr w:type="spellEnd"/>
-      <w:r>
-        <w:t xml:space="preserve">, </w:t>
-      </w:r>
-      <w:proofErr w:type="spellStart"/>
-      <w:r>
-        <w:t>SciPy</w:t>
-      </w:r>
-      <w:proofErr w:type="spellEnd"/>
-      <w:r>
-        <w:t xml:space="preserve">, </w:t>
-      </w:r>
-      <w:proofErr w:type="spellStart"/>
-      <w:r>
-        <w:t>statsmodels</w:t>
-      </w:r>
-      <w:proofErr w:type="spellEnd"/>
-      <w:r>
-        <w:t xml:space="preserve"> y </w:t>
-      </w:r>
-      <w:proofErr w:type="spellStart"/>
-      <w:r>
-        <w:t>PySpark</w:t>
-      </w:r>
-      <w:proofErr w:type="spellEnd"/>
-      <w:r>
-        <w:t>) para el cálculo de métricas, las pruebas estadísticas y la sistematización de los resultados que se visualizan en el tablero analítico.</w:t>
+        <w:t>: Python (pandas, scikit-learn, SciPy, statsmodels y PySpark) para el cálculo de métricas, las pruebas estadísticas y la sistematización de los resultados que se visualizan en el tablero analítico.</w:t>
       </w:r>
     </w:p>
     <w:p>
@@ -2401,23 +2185,7 @@
               <w:color w:val="000000"/>
               <w:lang w:val="en-US"/>
             </w:rPr>
-            <w:t xml:space="preserve">, 2015. </w:t>
-          </w:r>
-          <w:proofErr w:type="spellStart"/>
-          <w:r>
-            <w:rPr>
-              <w:color w:val="000000"/>
-              <w:lang w:val="en-US"/>
-            </w:rPr>
-            <w:t>doi</w:t>
-          </w:r>
-          <w:proofErr w:type="spellEnd"/>
-          <w:r>
-            <w:rPr>
-              <w:color w:val="000000"/>
-              <w:lang w:val="en-US"/>
-            </w:rPr>
-            <w:t>: 10.1109/bigdata.2015.7364082.</w:t>
+            <w:t>, 2015. doi: 10.1109/bigdata.2015.7364082.</w:t>
           </w:r>
         </w:p>
         <w:p>
@@ -2487,23 +2255,7 @@
               <w:color w:val="000000"/>
               <w:lang w:val="en-US"/>
             </w:rPr>
-            <w:t xml:space="preserve">, vol. 25, no. 9, p. 2945, 2025, </w:t>
-          </w:r>
-          <w:proofErr w:type="spellStart"/>
-          <w:r>
-            <w:rPr>
-              <w:color w:val="000000"/>
-              <w:lang w:val="en-US"/>
-            </w:rPr>
-            <w:t>doi</w:t>
-          </w:r>
-          <w:proofErr w:type="spellEnd"/>
-          <w:r>
-            <w:rPr>
-              <w:color w:val="000000"/>
-              <w:lang w:val="en-US"/>
-            </w:rPr>
-            <w:t>: 10.3390/s25092945.</w:t>
+            <w:t>, vol. 25, no. 9, p. 2945, 2025, doi: 10.3390/s25092945.</w:t>
           </w:r>
         </w:p>
         <w:p>
@@ -2529,45 +2281,21 @@
               <w:color w:val="000000"/>
             </w:rPr>
             <w:tab/>
-            <w:t xml:space="preserve">Y. A. Pincay Mendoza, V. C. Marcillo Salazar, V. V. García Constante, A. G. Espinoza Cesme, A. M. Morán Holguín, and G. A. Veloz Santa Cruz, “Decisiones gerenciales automatizadas: integrando Big Data y Machine </w:t>
-          </w:r>
-          <w:proofErr w:type="spellStart"/>
-          <w:r>
-            <w:rPr>
-              <w:color w:val="000000"/>
-            </w:rPr>
-            <w:t>Learning</w:t>
-          </w:r>
-          <w:proofErr w:type="spellEnd"/>
-          <w:r>
-            <w:rPr>
-              <w:color w:val="000000"/>
-            </w:rPr>
-            <w:t xml:space="preserve">,” </w:t>
-          </w:r>
-          <w:proofErr w:type="spellStart"/>
+            <w:t xml:space="preserve">Y. A. Pincay Mendoza, V. C. Marcillo Salazar, V. V. García Constante, A. G. Espinoza Cesme, A. M. Morán Holguín, and G. A. Veloz Santa Cruz, “Decisiones gerenciales automatizadas: integrando Big Data y Machine Learning,” </w:t>
+          </w:r>
           <w:r>
             <w:rPr>
               <w:i/>
               <w:iCs/>
               <w:color w:val="000000"/>
             </w:rPr>
-            <w:t>Cienc</w:t>
-          </w:r>
-          <w:proofErr w:type="spellEnd"/>
+            <w:t xml:space="preserve">Cienc. </w:t>
+          </w:r>
           <w:r>
             <w:rPr>
               <w:i/>
               <w:iCs/>
               <w:color w:val="000000"/>
-            </w:rPr>
-            <w:t xml:space="preserve">. </w:t>
-          </w:r>
-          <w:r>
-            <w:rPr>
-              <w:i/>
-              <w:iCs/>
-              <w:color w:val="000000"/>
               <w:lang w:val="en-US"/>
             </w:rPr>
             <w:t>Desarro.</w:t>
@@ -2577,39 +2305,7 @@
               <w:color w:val="000000"/>
               <w:lang w:val="en-US"/>
             </w:rPr>
-            <w:t xml:space="preserve">, vol. 28, no. 1, p. 357, 2025, </w:t>
-          </w:r>
-          <w:proofErr w:type="spellStart"/>
-          <w:r>
-            <w:rPr>
-              <w:color w:val="000000"/>
-              <w:lang w:val="en-US"/>
-            </w:rPr>
-            <w:t>doi</w:t>
-          </w:r>
-          <w:proofErr w:type="spellEnd"/>
-          <w:r>
-            <w:rPr>
-              <w:color w:val="000000"/>
-              <w:lang w:val="en-US"/>
-            </w:rPr>
-            <w:t>: 10.21503/</w:t>
-          </w:r>
-          <w:proofErr w:type="gramStart"/>
-          <w:r>
-            <w:rPr>
-              <w:color w:val="000000"/>
-              <w:lang w:val="en-US"/>
-            </w:rPr>
-            <w:t>cyd.v</w:t>
-          </w:r>
-          <w:proofErr w:type="gramEnd"/>
-          <w:r>
-            <w:rPr>
-              <w:color w:val="000000"/>
-              <w:lang w:val="en-US"/>
-            </w:rPr>
-            <w:t>28i1.2830.</w:t>
+            <w:t>, vol. 28, no. 1, p. 357, 2025, doi: 10.21503/cyd.v28i1.2830.</w:t>
           </w:r>
         </w:p>
         <w:p>
@@ -2636,25 +2332,8 @@
               <w:lang w:val="en-US"/>
             </w:rPr>
             <w:tab/>
-            <w:t xml:space="preserve">Q. Wang, Y. Huang, G. Zhao, E. Clark, W. Xia, and H. Liao, “DiarizationLM: Speaker </w:t>
-          </w:r>
-          <w:proofErr w:type="spellStart"/>
-          <w:r>
-            <w:rPr>
-              <w:color w:val="000000"/>
-              <w:lang w:val="en-US"/>
-            </w:rPr>
-            <w:t>Diarization</w:t>
-          </w:r>
-          <w:proofErr w:type="spellEnd"/>
-          <w:r>
-            <w:rPr>
-              <w:color w:val="000000"/>
-              <w:lang w:val="en-US"/>
-            </w:rPr>
-            <w:t xml:space="preserve"> Post-Processing with Large Language Models,” in </w:t>
-          </w:r>
-          <w:proofErr w:type="spellStart"/>
+            <w:t xml:space="preserve">Q. Wang, Y. Huang, G. Zhao, E. Clark, W. Xia, and H. Liao, “DiarizationLM: Speaker Diarization Post-Processing with Large Language Models,” in </w:t>
+          </w:r>
           <w:r>
             <w:rPr>
               <w:i/>
@@ -2662,40 +2341,14 @@
               <w:color w:val="000000"/>
               <w:lang w:val="en-US"/>
             </w:rPr>
-            <w:t>Interspeech</w:t>
-          </w:r>
-          <w:proofErr w:type="spellEnd"/>
-          <w:r>
-            <w:rPr>
-              <w:i/>
-              <w:iCs/>
-              <w:color w:val="000000"/>
-              <w:lang w:val="en-US"/>
-            </w:rPr>
-            <w:t xml:space="preserve"> 2024</w:t>
-          </w:r>
-          <w:r>
-            <w:rPr>
-              <w:color w:val="000000"/>
-              <w:lang w:val="en-US"/>
-            </w:rPr>
-            <w:t xml:space="preserve">, 2024. </w:t>
-          </w:r>
-          <w:proofErr w:type="spellStart"/>
-          <w:r>
-            <w:rPr>
-              <w:color w:val="000000"/>
-              <w:lang w:val="en-US"/>
-            </w:rPr>
-            <w:t>doi</w:t>
-          </w:r>
-          <w:proofErr w:type="spellEnd"/>
-          <w:r>
-            <w:rPr>
-              <w:color w:val="000000"/>
-              <w:lang w:val="en-US"/>
-            </w:rPr>
-            <w:t>: 10.21437/interspeech.2024-209.</w:t>
+            <w:t>Interspeech 2024</w:t>
+          </w:r>
+          <w:r>
+            <w:rPr>
+              <w:color w:val="000000"/>
+              <w:lang w:val="en-US"/>
+            </w:rPr>
+            <w:t>, 2024. doi: 10.21437/interspeech.2024-209.</w:t>
           </w:r>
         </w:p>
         <w:p>
@@ -2724,7 +2377,6 @@
             <w:tab/>
             <w:t xml:space="preserve">A. Koenecke, A. S. G. Choi, K. X. Mei, H. Schellmann, and M. Sloane, “Careless Whisper: Speech-to-Text Hallucination Harms,” in </w:t>
           </w:r>
-          <w:proofErr w:type="gramStart"/>
           <w:r>
             <w:rPr>
               <w:i/>
@@ -2732,40 +2384,14 @@
               <w:color w:val="000000"/>
               <w:lang w:val="en-US"/>
             </w:rPr>
-            <w:t>The</w:t>
-          </w:r>
-          <w:proofErr w:type="gramEnd"/>
-          <w:r>
-            <w:rPr>
-              <w:i/>
-              <w:iCs/>
-              <w:color w:val="000000"/>
-              <w:lang w:val="en-US"/>
-            </w:rPr>
-            <w:t xml:space="preserve"> 2024 ACM Conference on Fairness, Accountability, and Transparency</w:t>
-          </w:r>
-          <w:r>
-            <w:rPr>
-              <w:color w:val="000000"/>
-              <w:lang w:val="en-US"/>
-            </w:rPr>
-            <w:t xml:space="preserve">, 2024. </w:t>
-          </w:r>
-          <w:proofErr w:type="spellStart"/>
-          <w:r>
-            <w:rPr>
-              <w:color w:val="000000"/>
-              <w:lang w:val="en-US"/>
-            </w:rPr>
-            <w:t>doi</w:t>
-          </w:r>
-          <w:proofErr w:type="spellEnd"/>
-          <w:r>
-            <w:rPr>
-              <w:color w:val="000000"/>
-              <w:lang w:val="en-US"/>
-            </w:rPr>
-            <w:t>: 10.1145/3630106.3658996.</w:t>
+            <w:t>The 2024 ACM Conference on Fairness, Accountability, and Transparency</w:t>
+          </w:r>
+          <w:r>
+            <w:rPr>
+              <w:color w:val="000000"/>
+              <w:lang w:val="en-US"/>
+            </w:rPr>
+            <w:t>, 2024. doi: 10.1145/3630106.3658996.</w:t>
           </w:r>
         </w:p>
         <w:p>
@@ -2792,23 +2418,7 @@
               <w:lang w:val="en-US"/>
             </w:rPr>
             <w:tab/>
-            <w:t xml:space="preserve">C. Harris, C. </w:t>
-          </w:r>
-          <w:proofErr w:type="spellStart"/>
-          <w:r>
-            <w:rPr>
-              <w:color w:val="000000"/>
-              <w:lang w:val="en-US"/>
-            </w:rPr>
-            <w:t>Mgbahurike</w:t>
-          </w:r>
-          <w:proofErr w:type="spellEnd"/>
-          <w:r>
-            <w:rPr>
-              <w:color w:val="000000"/>
-              <w:lang w:val="en-US"/>
-            </w:rPr>
-            <w:t xml:space="preserve">, N. Kumar, and D. Yang, “Modeling Gender and Dialect Bias in Automatic Speech Recognition,” in </w:t>
+            <w:t xml:space="preserve">C. Harris, C. Mgbahurike, N. Kumar, and D. Yang, “Modeling Gender and Dialect Bias in Automatic Speech Recognition,” in </w:t>
           </w:r>
           <w:r>
             <w:rPr>
@@ -2824,23 +2434,7 @@
               <w:color w:val="000000"/>
               <w:lang w:val="en-US"/>
             </w:rPr>
-            <w:t xml:space="preserve">, 2024. </w:t>
-          </w:r>
-          <w:proofErr w:type="spellStart"/>
-          <w:r>
-            <w:rPr>
-              <w:color w:val="000000"/>
-              <w:lang w:val="en-US"/>
-            </w:rPr>
-            <w:t>doi</w:t>
-          </w:r>
-          <w:proofErr w:type="spellEnd"/>
-          <w:r>
-            <w:rPr>
-              <w:color w:val="000000"/>
-              <w:lang w:val="en-US"/>
-            </w:rPr>
-            <w:t>: 10.18653/v1/2024.findings-emnlp.890.</w:t>
+            <w:t>, 2024. doi: 10.18653/v1/2024.findings-emnlp.890.</w:t>
           </w:r>
         </w:p>
         <w:p>
@@ -2869,7 +2463,6 @@
             <w:tab/>
             <w:t xml:space="preserve">C. Barhoumi and Y. BenAyed, “Real-time speech emotion recognition using deep learning and data augmentation,” </w:t>
           </w:r>
-          <w:proofErr w:type="spellStart"/>
           <w:r>
             <w:rPr>
               <w:i/>
@@ -2877,40 +2470,14 @@
               <w:color w:val="000000"/>
               <w:lang w:val="en-US"/>
             </w:rPr>
-            <w:t>Artif</w:t>
-          </w:r>
-          <w:proofErr w:type="spellEnd"/>
-          <w:r>
-            <w:rPr>
-              <w:i/>
-              <w:iCs/>
-              <w:color w:val="000000"/>
-              <w:lang w:val="en-US"/>
-            </w:rPr>
-            <w:t>. Intell. Rev.</w:t>
-          </w:r>
-          <w:r>
-            <w:rPr>
-              <w:color w:val="000000"/>
-              <w:lang w:val="en-US"/>
-            </w:rPr>
-            <w:t xml:space="preserve">, vol. 58, no. 2, 2024, </w:t>
-          </w:r>
-          <w:proofErr w:type="spellStart"/>
-          <w:r>
-            <w:rPr>
-              <w:color w:val="000000"/>
-              <w:lang w:val="en-US"/>
-            </w:rPr>
-            <w:t>doi</w:t>
-          </w:r>
-          <w:proofErr w:type="spellEnd"/>
-          <w:r>
-            <w:rPr>
-              <w:color w:val="000000"/>
-              <w:lang w:val="en-US"/>
-            </w:rPr>
-            <w:t>: 10.1007/s10462-024-11065-x.</w:t>
+            <w:t>Artif. Intell. Rev.</w:t>
+          </w:r>
+          <w:r>
+            <w:rPr>
+              <w:color w:val="000000"/>
+              <w:lang w:val="en-US"/>
+            </w:rPr>
+            <w:t>, vol. 58, no. 2, 2024, doi: 10.1007/s10462-024-11065-x.</w:t>
           </w:r>
         </w:p>
         <w:p>
@@ -2953,23 +2520,7 @@
               <w:color w:val="000000"/>
               <w:lang w:val="en-US"/>
             </w:rPr>
-            <w:t xml:space="preserve">, “Large Language Models: A Survey,” 2024. </w:t>
-          </w:r>
-          <w:proofErr w:type="spellStart"/>
-          <w:r>
-            <w:rPr>
-              <w:color w:val="000000"/>
-              <w:lang w:val="en-US"/>
-            </w:rPr>
-            <w:t>doi</w:t>
-          </w:r>
-          <w:proofErr w:type="spellEnd"/>
-          <w:r>
-            <w:rPr>
-              <w:color w:val="000000"/>
-              <w:lang w:val="en-US"/>
-            </w:rPr>
-            <w:t>: 10.48550/arxiv.2402.06196.</w:t>
+            <w:t>, “Large Language Models: A Survey,” 2024. doi: 10.48550/arxiv.2402.06196.</w:t>
           </w:r>
         </w:p>
         <w:p>
@@ -3028,23 +2579,7 @@
               <w:color w:val="000000"/>
               <w:lang w:val="en-US"/>
             </w:rPr>
-            <w:t xml:space="preserve">, vol. 12, pp. 26839–26874, 2024, </w:t>
-          </w:r>
-          <w:proofErr w:type="spellStart"/>
-          <w:r>
-            <w:rPr>
-              <w:color w:val="000000"/>
-              <w:lang w:val="en-US"/>
-            </w:rPr>
-            <w:t>doi</w:t>
-          </w:r>
-          <w:proofErr w:type="spellEnd"/>
-          <w:r>
-            <w:rPr>
-              <w:color w:val="000000"/>
-              <w:lang w:val="en-US"/>
-            </w:rPr>
-            <w:t>: 10.1109/access.2024.3365742.</w:t>
+            <w:t>, vol. 12, pp. 26839–26874, 2024, doi: 10.1109/access.2024.3365742.</w:t>
           </w:r>
         </w:p>
         <w:p>
@@ -3087,23 +2622,7 @@
               <w:color w:val="000000"/>
               <w:lang w:val="en-US"/>
             </w:rPr>
-            <w:t xml:space="preserve">, 2024. </w:t>
-          </w:r>
-          <w:proofErr w:type="spellStart"/>
-          <w:r>
-            <w:rPr>
-              <w:color w:val="000000"/>
-              <w:lang w:val="en-US"/>
-            </w:rPr>
-            <w:t>doi</w:t>
-          </w:r>
-          <w:proofErr w:type="spellEnd"/>
-          <w:r>
-            <w:rPr>
-              <w:color w:val="000000"/>
-              <w:lang w:val="en-US"/>
-            </w:rPr>
-            <w:t>: 10.18653/v1/2024.findings-naacl.246.</w:t>
+            <w:t>, 2024. doi: 10.18653/v1/2024.findings-naacl.246.</w:t>
           </w:r>
         </w:p>
         <w:p>
@@ -3135,37 +2654,13 @@
               <w:iCs/>
               <w:color w:val="000000"/>
             </w:rPr>
-            <w:t xml:space="preserve">Inge </w:t>
-          </w:r>
-          <w:proofErr w:type="spellStart"/>
-          <w:r>
-            <w:rPr>
-              <w:i/>
-              <w:iCs/>
-              <w:color w:val="000000"/>
-            </w:rPr>
-            <w:t>CuC</w:t>
-          </w:r>
-          <w:proofErr w:type="spellEnd"/>
-          <w:r>
-            <w:rPr>
-              <w:color w:val="000000"/>
-            </w:rPr>
-            <w:t xml:space="preserve">, vol. 21, no. 1, pp. 95–114, 2025, </w:t>
-          </w:r>
-          <w:proofErr w:type="spellStart"/>
-          <w:r>
-            <w:rPr>
-              <w:color w:val="000000"/>
-            </w:rPr>
-            <w:t>doi</w:t>
-          </w:r>
-          <w:proofErr w:type="spellEnd"/>
-          <w:r>
-            <w:rPr>
-              <w:color w:val="000000"/>
-            </w:rPr>
-            <w:t>: 10.17981/ingecuc.21.1.2025.08.</w:t>
+            <w:t>Inge CuC</w:t>
+          </w:r>
+          <w:r>
+            <w:rPr>
+              <w:color w:val="000000"/>
+            </w:rPr>
+            <w:t>, vol. 21, no. 1, pp. 95–114, 2025, doi: 10.17981/ingecuc.21.1.2025.08.</w:t>
           </w:r>
         </w:p>
         <w:p>
@@ -3208,23 +2703,7 @@
               <w:color w:val="000000"/>
               <w:lang w:val="en-US"/>
             </w:rPr>
-            <w:t xml:space="preserve">, “Large Language Models for Forecasting and Anomaly Detection: A Systematic Literature Review,” 2024. </w:t>
-          </w:r>
-          <w:proofErr w:type="spellStart"/>
-          <w:r>
-            <w:rPr>
-              <w:color w:val="000000"/>
-              <w:lang w:val="en-US"/>
-            </w:rPr>
-            <w:t>doi</w:t>
-          </w:r>
-          <w:proofErr w:type="spellEnd"/>
-          <w:r>
-            <w:rPr>
-              <w:color w:val="000000"/>
-              <w:lang w:val="en-US"/>
-            </w:rPr>
-            <w:t>: 10.48550/arxiv.2402.10350.</w:t>
+            <w:t>, “Large Language Models for Forecasting and Anomaly Detection: A Systematic Literature Review,” 2024. doi: 10.48550/arxiv.2402.10350.</w:t>
           </w:r>
         </w:p>
         <w:p>
@@ -3253,7 +2732,6 @@
             <w:tab/>
             <w:t xml:space="preserve">E. Edozie, A. N. Shuaibu, B. O. Sadiq, and U. K. John, “Artificial intelligence advances in anomaly detection for telecom networks,” </w:t>
           </w:r>
-          <w:proofErr w:type="spellStart"/>
           <w:r>
             <w:rPr>
               <w:i/>
@@ -3261,40 +2739,14 @@
               <w:color w:val="000000"/>
               <w:lang w:val="en-US"/>
             </w:rPr>
-            <w:t>Artif</w:t>
-          </w:r>
-          <w:proofErr w:type="spellEnd"/>
-          <w:r>
-            <w:rPr>
-              <w:i/>
-              <w:iCs/>
-              <w:color w:val="000000"/>
-              <w:lang w:val="en-US"/>
-            </w:rPr>
-            <w:t>. Intell. Rev.</w:t>
-          </w:r>
-          <w:r>
-            <w:rPr>
-              <w:color w:val="000000"/>
-              <w:lang w:val="en-US"/>
-            </w:rPr>
-            <w:t xml:space="preserve">, vol. 58, no. 4, 2025, </w:t>
-          </w:r>
-          <w:proofErr w:type="spellStart"/>
-          <w:r>
-            <w:rPr>
-              <w:color w:val="000000"/>
-              <w:lang w:val="en-US"/>
-            </w:rPr>
-            <w:t>doi</w:t>
-          </w:r>
-          <w:proofErr w:type="spellEnd"/>
-          <w:r>
-            <w:rPr>
-              <w:color w:val="000000"/>
-              <w:lang w:val="en-US"/>
-            </w:rPr>
-            <w:t>: 10.1007/s10462-025-11108-x.</w:t>
+            <w:t>Artif. Intell. Rev.</w:t>
+          </w:r>
+          <w:r>
+            <w:rPr>
+              <w:color w:val="000000"/>
+              <w:lang w:val="en-US"/>
+            </w:rPr>
+            <w:t>, vol. 58, no. 4, 2025, doi: 10.1007/s10462-025-11108-x.</w:t>
           </w:r>
         </w:p>
         <w:p>
@@ -3323,7 +2775,6 @@
             <w:tab/>
             <w:t xml:space="preserve">K. Berahmand, F. Daneshfar, E. S. Salehi, Y. Li, and Y. Xu, “Autoencoders and their applications in machine learning: a survey,” </w:t>
           </w:r>
-          <w:proofErr w:type="spellStart"/>
           <w:r>
             <w:rPr>
               <w:i/>
@@ -3331,40 +2782,14 @@
               <w:color w:val="000000"/>
               <w:lang w:val="en-US"/>
             </w:rPr>
-            <w:t>Artif</w:t>
-          </w:r>
-          <w:proofErr w:type="spellEnd"/>
-          <w:r>
-            <w:rPr>
-              <w:i/>
-              <w:iCs/>
-              <w:color w:val="000000"/>
-              <w:lang w:val="en-US"/>
-            </w:rPr>
-            <w:t>. Intell. Rev.</w:t>
-          </w:r>
-          <w:r>
-            <w:rPr>
-              <w:color w:val="000000"/>
-              <w:lang w:val="en-US"/>
-            </w:rPr>
-            <w:t xml:space="preserve">, vol. 57, no. 2, 2024, </w:t>
-          </w:r>
-          <w:proofErr w:type="spellStart"/>
-          <w:r>
-            <w:rPr>
-              <w:color w:val="000000"/>
-              <w:lang w:val="en-US"/>
-            </w:rPr>
-            <w:t>doi</w:t>
-          </w:r>
-          <w:proofErr w:type="spellEnd"/>
-          <w:r>
-            <w:rPr>
-              <w:color w:val="000000"/>
-              <w:lang w:val="en-US"/>
-            </w:rPr>
-            <w:t>: 10.1007/s10462-023-10662-6.</w:t>
+            <w:t>Artif. Intell. Rev.</w:t>
+          </w:r>
+          <w:r>
+            <w:rPr>
+              <w:color w:val="000000"/>
+              <w:lang w:val="en-US"/>
+            </w:rPr>
+            <w:t>, vol. 57, no. 2, 2024, doi: 10.1007/s10462-023-10662-6.</w:t>
           </w:r>
         </w:p>
         <w:p>
@@ -3423,23 +2848,7 @@
               <w:color w:val="000000"/>
               <w:lang w:val="en-US"/>
             </w:rPr>
-            <w:t xml:space="preserve">, vol. 16, no. 7–8, pp. 5079–5112, 2025, </w:t>
-          </w:r>
-          <w:proofErr w:type="spellStart"/>
-          <w:r>
-            <w:rPr>
-              <w:color w:val="000000"/>
-              <w:lang w:val="en-US"/>
-            </w:rPr>
-            <w:t>doi</w:t>
-          </w:r>
-          <w:proofErr w:type="spellEnd"/>
-          <w:r>
-            <w:rPr>
-              <w:color w:val="000000"/>
-              <w:lang w:val="en-US"/>
-            </w:rPr>
-            <w:t>: 10.1007/s13042-025-02560-w.</w:t>
+            <w:t>, vol. 16, no. 7–8, pp. 5079–5112, 2025, doi: 10.1007/s13042-025-02560-w.</w:t>
           </w:r>
         </w:p>
         <w:p>
@@ -3482,23 +2891,7 @@
               <w:color w:val="000000"/>
               <w:lang w:val="en-US"/>
             </w:rPr>
-            <w:t xml:space="preserve">, vol. 28, no. 1, pp. 75–105, 2004, </w:t>
-          </w:r>
-          <w:proofErr w:type="spellStart"/>
-          <w:r>
-            <w:rPr>
-              <w:color w:val="000000"/>
-              <w:lang w:val="en-US"/>
-            </w:rPr>
-            <w:t>doi</w:t>
-          </w:r>
-          <w:proofErr w:type="spellEnd"/>
-          <w:r>
-            <w:rPr>
-              <w:color w:val="000000"/>
-              <w:lang w:val="en-US"/>
-            </w:rPr>
-            <w:t>: 10.2307/25148625.</w:t>
+            <w:t>, vol. 28, no. 1, pp. 75–105, 2004, doi: 10.2307/25148625.</w:t>
           </w:r>
         </w:p>
         <w:p>
@@ -3647,6 +3040,7 @@
             <w:r>
               <w:rPr>
                 <w:rFonts w:ascii="Segoe UI Symbol" w:hAnsi="Segoe UI Symbol" w:cs="Segoe UI Symbol"/>
+                <w:highlight w:val="black"/>
               </w:rPr>
               <w:t>☐</w:t>
             </w:r>
@@ -6040,8 +5434,12 @@
     <w:rsid w:val="00223DE9"/>
     <w:rsid w:val="004A47C6"/>
     <w:rsid w:val="00534B97"/>
+    <w:rsid w:val="00617687"/>
+    <w:rsid w:val="00901F4A"/>
+    <w:rsid w:val="00C63E10"/>
     <w:rsid w:val="00D863CA"/>
     <w:rsid w:val="00EB4DE7"/>
+    <w:rsid w:val="00FA67B5"/>
   </w:rsids>
   <m:mathPr>
     <m:mathFont m:val="Cambria Math"/>

</xml_diff>